<commit_message>
Add the debug, recording and live-map figures to the report
Week 3 gains the debug page, week 5 the recording, save-or-discard and
session-list screens, and week 6 the live map from a real ride, matching
the figures already in the phase folders. Re-exports the PDF and Word copy.
</commit_message>
<xml_diff>
--- a/Documentation/Final Report/SkateGuard-Weekly-Report.docx
+++ b/Documentation/Final Report/SkateGuard-Weekly-Report.docx
@@ -2248,6 +2248,48 @@
       </w:r>
     </w:p>
     <w:p>
+      <w:pPr/>
+      <w:r>
+        <w:t xml:space="preserve">The debug page shows the same values live, twice a second, which is what the thresholds were set against.</w:t>
+      </w:r>
+    </w:p>
+    <w:p>
+      <w:pPr/>
+      <w:r>
+        <w:drawing>
+          <wp:inline distT="0" distB="0" distL="0" distR="0">
+            <wp:extent cx="3875930" cy="7498080"/>
+            <wp:docPr id="18" name="image18" descr="The debug page: stage, gyro rate, each window against its limit, counts, GPS and radio"/>
+            <a:graphic xmlns:a="http://schemas.openxmlformats.org/drawingml/2006/main">
+              <a:graphicData uri="http://schemas.openxmlformats.org/drawingml/2006/picture">
+                <pic:pic xmlns:pic="http://schemas.openxmlformats.org/drawingml/2006/picture">
+                  <pic:nvPicPr>
+                    <pic:cNvPr id="18" name="image18" descr="The debug page: stage, gyro rate, each window against its limit, counts, GPS and radio"/>
+                    <pic:cNvPicPr/>
+                  </pic:nvPicPr>
+                  <pic:blipFill>
+                    <a:blip r:embed="rId20"/>
+                    <a:stretch>
+                      <a:fillRect/>
+                    </a:stretch>
+                  </pic:blipFill>
+                  <pic:spPr>
+                    <a:xfrm>
+                      <a:off x="0" y="0"/>
+                      <a:ext cx="3875930" cy="7498080"/>
+                    </a:xfrm>
+                    <a:prstGeom prst="rect">
+                      <a:avLst/>
+                    </a:prstGeom>
+                  </pic:spPr>
+                </pic:pic>
+              </a:graphicData>
+            </a:graphic>
+          </wp:inline>
+        </w:drawing>
+      </w:r>
+    </w:p>
+    <w:p>
       <w:pPr>
         <w:pStyle w:val="Heading2"/>
       </w:pPr>
@@ -2476,37 +2518,7 @@
     <w:p>
       <w:pPr/>
       <w:r>
-        <w:drawing>
-          <wp:inline distT="0" distB="0" distL="0" distR="0">
-            <wp:extent cx="5486400" cy="2113280"/>
-            <wp:docPr id="18" name="image18" descr="The wrist unit showing the dashboard address"/>
-            <a:graphic xmlns:a="http://schemas.openxmlformats.org/drawingml/2006/main">
-              <a:graphicData uri="http://schemas.openxmlformats.org/drawingml/2006/picture">
-                <pic:pic xmlns:pic="http://schemas.openxmlformats.org/drawingml/2006/picture">
-                  <pic:nvPicPr>
-                    <pic:cNvPr id="18" name="image18" descr="The wrist unit showing the dashboard address"/>
-                    <pic:cNvPicPr/>
-                  </pic:nvPicPr>
-                  <pic:blipFill>
-                    <a:blip r:embed="rId20"/>
-                    <a:stretch>
-                      <a:fillRect/>
-                    </a:stretch>
-                  </pic:blipFill>
-                  <pic:spPr>
-                    <a:xfrm>
-                      <a:off x="0" y="0"/>
-                      <a:ext cx="5486400" cy="2113280"/>
-                    </a:xfrm>
-                    <a:prstGeom prst="rect">
-                      <a:avLst/>
-                    </a:prstGeom>
-                  </pic:spPr>
-                </pic:pic>
-              </a:graphicData>
-            </a:graphic>
-          </wp:inline>
-        </w:drawing>
+        <w:t xml:space="preserve">[image: The wrist unit showing the dashboard address]</w:t>
       </w:r>
     </w:p>
     <w:p>
@@ -2874,6 +2886,24 @@
       <w:pPr/>
       <w:r>
         <w:t xml:space="preserve">Stopping a ride does not save it: the card offers Save or Discard, and nothing is written until one is chosen. A saved ride stores its distance, average speed, top speed, land count, bail count and wobble-alert count. Saved rides go to LittleFS, the last 7 kept, with a route point every 30 seconds up to 20 points. Each row can be downloaded as a CSV of the ride plus a rendered PNG of its route, drawn in the browser over OpenStreetMap tiles.</w:t>
+      </w:r>
+    </w:p>
+    <w:p>
+      <w:pPr/>
+      <w:r>
+        <w:t xml:space="preserve">[image: Recording in progress]</w:t>
+      </w:r>
+    </w:p>
+    <w:p>
+      <w:pPr/>
+      <w:r>
+        <w:t xml:space="preserve">[image: Stopped, offering Save or Discard]</w:t>
+      </w:r>
+    </w:p>
+    <w:p>
+      <w:pPr/>
+      <w:r>
+        <w:t xml:space="preserve">[image: The session list after saving]</w:t>
       </w:r>
     </w:p>
     <w:p>
@@ -3212,6 +3242,12 @@
       <w:pPr/>
       <w:r>
         <w:t xml:space="preserve">[image: A recorded session drawn over OpenStreetMap tiles]</w:t>
+      </w:r>
+    </w:p>
+    <w:p>
+      <w:pPr/>
+      <w:r>
+        <w:t xml:space="preserve">[image: The live map during a real ride]</w:t>
       </w:r>
     </w:p>
     <w:p>

</xml_diff>